<commit_message>
docs(gouvernance): align governance documents with the 16 000 € first tier
- PV CA n°1: split the year-1 budget (3 930 € operations + 15 820 € first
  tier replacing phase 3), Premier Secours fund cap raised to 4 000 €
- Protocol, hotel voucher and convention: 85 € family room, 110 €/day
  per family, activation requires the tier to be raised
- Internal rules: new article 22 bis on the association vehicle
- Equipment sheet: vehicle drivers list and logbook
- Add the rescrit mécénat answers (md, html, pdf)
- Mark the docx generator as CommonJS so the documented build runs

Co-Authored-By: Claude Opus 5.5 <noreply@anthropic.com>
</commit_message>
<xml_diff>
--- a/gouvernance/word/00_Sommaire_et_suivi.docx
+++ b/gouvernance/word/00_Sommaire_et_suivi.docx
@@ -113,7 +113,7 @@
           <w:sz w:val="17"/>
           <w:szCs w:val="17"/>
         </w:rPr>
-        <w:t xml:space="preserve">Version 1.0 · octobre 2026 · Chaque document existe en Word (modifiable) et en PDF</w:t>
+        <w:t xml:space="preserve">Version 1.1 · octobre 2026 · Mise à jour : premier palier de 16 000 € · Chaque document existe en Word (modifiable) et en PDF</w:t>
       </w:r>
     </w:p>
     <w:p>
@@ -545,7 +545,7 @@
                 <w:sz w:val="18"/>
                 <w:szCs w:val="18"/>
               </w:rPr>
-              <w:t xml:space="preserve">Cotisations, budget, banque, assurance, délégation, fonds</w:t>
+              <w:t xml:space="preserve">Cotisations, budget et premier palier, banque, assurance, délégation, fonds</w:t>
             </w:r>
           </w:p>
         </w:tc>
@@ -3888,6 +3888,75 @@
         </w:tblBorders>
       </w:tblPr>
       <w:tblGrid>
+        <w:gridCol w:w="9638"/>
+      </w:tblGrid>
+      <w:tr>
+        <w:tc>
+          <w:tcPr>
+            <w:tcW w:type="dxa" w:w="9638"/>
+            <w:tcBorders>
+              <w:top w:val="single" w:color="FFF4EA" w:sz="4"/>
+              <w:left w:val="single" w:color="F4A259" w:sz="24"/>
+              <w:bottom w:val="single" w:color="FFF4EA" w:sz="4"/>
+              <w:right w:val="single" w:color="FFF4EA" w:sz="4"/>
+            </w:tcBorders>
+            <w:shd w:fill="FFF4EA" w:color="auto" w:val="clear"/>
+            <w:tcMar>
+              <w:top w:type="dxa" w:w="100"/>
+              <w:left w:type="dxa" w:w="180"/>
+              <w:bottom w:type="dxa" w:w="100"/>
+              <w:right w:type="dxa" w:w="140"/>
+            </w:tcMar>
+          </w:tcPr>
+          <w:p>
+            <w:pPr>
+              <w:spacing w:after="40" w:before="40"/>
+            </w:pPr>
+            <w:r>
+              <w:rPr>
+                <w:sz w:val="18"/>
+                <w:szCs w:val="18"/>
+              </w:rPr>
+              <w:t xml:space="preserve">La phase 3 est financée par le </w:t>
+            </w:r>
+            <w:r>
+              <w:rPr>
+                <w:b/>
+                <w:bCs/>
+                <w:sz w:val="18"/>
+                <w:szCs w:val="18"/>
+              </w:rPr>
+              <w:t xml:space="preserve">premier palier de 16 000 €</w:t>
+            </w:r>
+            <w:r>
+              <w:rPr>
+                <w:sz w:val="18"/>
+                <w:szCs w:val="18"/>
+              </w:rPr>
+              <w:t xml:space="preserve"> (budget chiffré 15 820 €) : véhicule 7 places (9 700 €), Fonds de Premier Secours Social (4 000 €), équipe de 4 bénévoles (1 140 €), liaison et sécurité (980 €). Le dispositif n'est activé qu'une fois ce palier réuni.</w:t>
+            </w:r>
+          </w:p>
+        </w:tc>
+      </w:tr>
+    </w:tbl>
+    <w:p>
+      <w:pPr>
+        <w:spacing w:after="60"/>
+      </w:pPr>
+    </w:p>
+    <w:tbl>
+      <w:tblPr>
+        <w:tblW w:type="dxa" w:w="9638"/>
+        <w:tblBorders>
+          <w:top w:val="single" w:color="auto" w:sz="4"/>
+          <w:left w:val="single" w:color="auto" w:sz="4"/>
+          <w:bottom w:val="single" w:color="auto" w:sz="4"/>
+          <w:right w:val="single" w:color="auto" w:sz="4"/>
+          <w:insideH w:val="single" w:color="auto" w:sz="4"/>
+          <w:insideV w:val="single" w:color="auto" w:sz="4"/>
+        </w:tblBorders>
+      </w:tblPr>
+      <w:tblGrid>
         <w:gridCol w:w="600"/>
         <w:gridCol w:w="2700"/>
         <w:gridCol w:w="1100"/>
@@ -5541,7 +5610,7 @@
                 <w:sz w:val="18"/>
                 <w:szCs w:val="18"/>
               </w:rPr>
-              <w:t xml:space="preserve">Dotation des bénévoles</w:t>
+              <w:t xml:space="preserve">Dotation des bénévoles, carnet de bord du véhicule</w:t>
             </w:r>
           </w:p>
         </w:tc>

</xml_diff>